<commit_message>
Rename development center to rights center
</commit_message>
<xml_diff>
--- a/docs/EE_Student_Union_网站定位说明.docx
+++ b/docs/EE_Student_Union_网站定位说明.docx
@@ -77,7 +77,7 @@
         </w:numPr>
       </w:pPr>
       <w:r>
-        <w:t>做一套面向四个大家庭的公共档案，把文艺、体育、联络、全发的工作都纳入同一套展示体系。</w:t>
+        <w:t>做一套面向四个大家庭的公共档案，把文艺、体育、联络、权发的工作都纳入同一套展示体系。</w:t>
       </w:r>
     </w:p>
     <w:p>
@@ -368,7 +368,7 @@
           <w:p>
             <w:pPr/>
             <w:r>
-              <w:t>全发中心</w:t>
+              <w:t>权发中心</w:t>
             </w:r>
           </w:p>
         </w:tc>
@@ -385,7 +385,7 @@
           <w:p>
             <w:pPr/>
             <w:r>
-              <w:t>全面发展、权益反馈、成长支持和师生沟通</w:t>
+              <w:t>权益发展、成长支持、反馈沟通和长期建设</w:t>
             </w:r>
           </w:p>
         </w:tc>
@@ -513,7 +513,7 @@
         </w:numPr>
       </w:pPr>
       <w:r>
-        <w:t>中心专题页：文艺、体育、联络、全发分别拥有独立页面，突出各自传统和代表项目。</w:t>
+        <w:t>中心专题页：文艺、体育、联络、权发分别拥有独立页面，突出各自传统和代表项目。</w:t>
       </w:r>
     </w:p>
     <w:p>
@@ -557,7 +557,7 @@
         </w:numPr>
       </w:pPr>
       <w:r>
-        <w:t>补充真实照片：优先收集学生节、马杯、系歌赛、名企微体验、全发项目等高清图片。</w:t>
+        <w:t>补充真实照片：优先收集学生节、马杯、系歌赛、名企微体验、权发项目等高清图片。</w:t>
       </w:r>
     </w:p>
     <w:p>

</xml_diff>